<commit_message>
Playbook: carry in newly checked Bursa disclosure points
Add selective-disclosure (9.08) and winding-up petition (9.19(19)) rows, UMA paragraph-number drift note (9.11 vs 9.16), halt examples and Bursa 5pm close, PDPA 72-hour source nuance, and five secondary sources. Bursa's own text was still not reachable, so tags stay [C, secondary] or [V].

Co-Authored-By: Claude Sonnet 5.5 <noreply@anthropic.com>
Claude-Session: https://claude.ai/code/session_01JcQ7arsrDHhSr3Jj9M4wY7
</commit_message>
<xml_diff>
--- a/docs/crisis-communications-playbook-malaysia-plc.docx
+++ b/docs/crisis-communications-playbook-malaysia-plc.docx
@@ -6221,50 +6221,70 @@
               <w:rPr>
                 <w:sz w:val="17"/>
               </w:rPr>
-              <w:t xml:space="preserve">Narrow. Withholding is expected to end as soon as there is a leak, rumour, report, or unusual market activity suggesting the information is out. Bursa enforcement releases state that the right to withhold ceases where UMA signifies a possible leak.</w:t>
-            </w:r>
-          </w:p>
-        </w:tc>
-        <w:tc>
-          <w:tcPr/>
-          <w:p>
-            <w:pPr>
-              <w:pStyle w:val="Compact"/>
-              <w:spacing w:after="40" w:before="40"/>
-              <w:jc w:val="left"/>
-            </w:pPr>
+              <w:t xml:space="preserve">Narrow. Withholding is expected to end as soon as there is a leak, rumour, report, or unusual market activity suggesting the information is out. Bursa enforcement releases state that the right to withhold ceases where UMA signifies a possible leak. Secondary summaries of Bursa's guidance also say that Para 9.05 permits temporary non-disclosure only in exceptional circumstances with complete confidentiality, and that issuers should not accept confidentiality undertakings that defeat the immediate-disclosure duty (Para 9.06)</w:t>
+            </w:r>
+            <w:r>
+              <w:rPr>
+                <w:sz w:val="17"/>
+              </w:rPr>
+              <w:t xml:space="preserve"> </w:t>
+            </w:r>
             <w:r>
               <w:rPr>
                 <w:bCs/>
                 <w:b/>
                 <w:sz w:val="17"/>
               </w:rPr>
-              <w:t xml:space="preserve">[C]</w:t>
-            </w:r>
-            <w:r>
-              <w:rPr>
-                <w:sz w:val="17"/>
-              </w:rPr>
-              <w:t xml:space="preserve"> </w:t>
-            </w:r>
-            <w:r>
-              <w:rPr>
-                <w:sz w:val="17"/>
-              </w:rPr>
-              <w:t xml:space="preserve">on the principle;</w:t>
-            </w:r>
-            <w:r>
-              <w:rPr>
-                <w:sz w:val="17"/>
-              </w:rPr>
-              <w:t xml:space="preserve"> </w:t>
-            </w:r>
+              <w:t xml:space="preserve">[C, secondary]</w:t>
+            </w:r>
+            <w:r>
+              <w:rPr>
+                <w:sz w:val="17"/>
+              </w:rPr>
+              <w:t xml:space="preserve">.</w:t>
+            </w:r>
+          </w:p>
+        </w:tc>
+        <w:tc>
+          <w:tcPr/>
+          <w:p>
+            <w:pPr>
+              <w:pStyle w:val="Compact"/>
+              <w:spacing w:after="40" w:before="40"/>
+              <w:jc w:val="left"/>
+            </w:pPr>
             <w:r>
               <w:rPr>
                 <w:bCs/>
                 <w:b/>
                 <w:sz w:val="17"/>
               </w:rPr>
+              <w:t xml:space="preserve">[C]</w:t>
+            </w:r>
+            <w:r>
+              <w:rPr>
+                <w:sz w:val="17"/>
+              </w:rPr>
+              <w:t xml:space="preserve"> </w:t>
+            </w:r>
+            <w:r>
+              <w:rPr>
+                <w:sz w:val="17"/>
+              </w:rPr>
+              <w:t xml:space="preserve">on the principle;</w:t>
+            </w:r>
+            <w:r>
+              <w:rPr>
+                <w:sz w:val="17"/>
+              </w:rPr>
+              <w:t xml:space="preserve"> </w:t>
+            </w:r>
+            <w:r>
+              <w:rPr>
+                <w:bCs/>
+                <w:b/>
+                <w:sz w:val="17"/>
+              </w:rPr>
               <w:t xml:space="preserve">[V]</w:t>
             </w:r>
             <w:r>
@@ -6345,25 +6365,109 @@
               <w:rPr>
                 <w:sz w:val="17"/>
               </w:rPr>
-              <w:t xml:space="preserve">Bursa enforcement releases on Lay Hong Berhad and Tecnic Group Berhad (both 2017) describe public reprimands and fines on directors for breaches of Para 9.16(1)(a) in UMA responses. UMA replies are issued as board-endorsed announcements.</w:t>
-            </w:r>
-          </w:p>
-        </w:tc>
-        <w:tc>
-          <w:tcPr/>
-          <w:p>
-            <w:pPr>
-              <w:pStyle w:val="Compact"/>
-              <w:spacing w:after="40" w:before="40"/>
-              <w:jc w:val="left"/>
-            </w:pPr>
+              <w:t xml:space="preserve">Bursa enforcement releases on Lay Hong Berhad and Tecnic Group Berhad (both 2017) describe public reprimands and fines on directors for breaches of Para 9.16(1)(a) in UMA responses. UMA replies are issued as board-endorsed announcements. A more recent UMA query reported in August 2026 (Zetrix AI, Business Today) cites</w:t>
+            </w:r>
+            <w:r>
+              <w:rPr>
+                <w:sz w:val="17"/>
+              </w:rPr>
+              <w:t xml:space="preserve"> </w:t>
+            </w:r>
             <w:r>
               <w:rPr>
                 <w:bCs/>
                 <w:b/>
                 <w:sz w:val="17"/>
               </w:rPr>
+              <w:t xml:space="preserve">Para 9.11</w:t>
+            </w:r>
+            <w:r>
+              <w:rPr>
+                <w:sz w:val="17"/>
+              </w:rPr>
+              <w:t xml:space="preserve"> </w:t>
+            </w:r>
+            <w:r>
+              <w:rPr>
+                <w:sz w:val="17"/>
+              </w:rPr>
+              <w:t xml:space="preserve">and asks the issuer to make immediate enquiries of its board, major shareholders and relevant personnel, so the paragraph number may differ from the 2017 releases: confirm the current number. Bursa has said that an inaccurate or misleading reply can lead to enforcement against the issuer and culpable directors, and that a UMA query does not by itself mean a suspension</w:t>
+            </w:r>
+            <w:r>
+              <w:rPr>
+                <w:sz w:val="17"/>
+              </w:rPr>
+              <w:t xml:space="preserve"> </w:t>
+            </w:r>
+            <w:r>
+              <w:rPr>
+                <w:bCs/>
+                <w:b/>
+                <w:sz w:val="17"/>
+              </w:rPr>
               <w:t xml:space="preserve">[C]</w:t>
+            </w:r>
+            <w:r>
+              <w:rPr>
+                <w:sz w:val="17"/>
+              </w:rPr>
+              <w:t xml:space="preserve">.</w:t>
+            </w:r>
+          </w:p>
+        </w:tc>
+        <w:tc>
+          <w:tcPr/>
+          <w:p>
+            <w:pPr>
+              <w:pStyle w:val="Compact"/>
+              <w:spacing w:after="40" w:before="40"/>
+              <w:jc w:val="left"/>
+            </w:pPr>
+            <w:r>
+              <w:rPr>
+                <w:bCs/>
+                <w:b/>
+                <w:sz w:val="17"/>
+              </w:rPr>
+              <w:t xml:space="preserve">[C]</w:t>
+            </w:r>
+            <w:r>
+              <w:rPr>
+                <w:sz w:val="17"/>
+              </w:rPr>
+              <w:t xml:space="preserve"> </w:t>
+            </w:r>
+            <w:r>
+              <w:rPr>
+                <w:sz w:val="17"/>
+              </w:rPr>
+              <w:t xml:space="preserve">on the process;</w:t>
+            </w:r>
+            <w:r>
+              <w:rPr>
+                <w:sz w:val="17"/>
+              </w:rPr>
+              <w:t xml:space="preserve"> </w:t>
+            </w:r>
+            <w:r>
+              <w:rPr>
+                <w:bCs/>
+                <w:b/>
+                <w:sz w:val="17"/>
+              </w:rPr>
+              <w:t xml:space="preserve">[V]</w:t>
+            </w:r>
+            <w:r>
+              <w:rPr>
+                <w:sz w:val="17"/>
+              </w:rPr>
+              <w:t xml:space="preserve"> </w:t>
+            </w:r>
+            <w:r>
+              <w:rPr>
+                <w:sz w:val="17"/>
+              </w:rPr>
+              <w:t xml:space="preserve">on the current paragraph number</w:t>
             </w:r>
           </w:p>
         </w:tc>
@@ -6517,18 +6621,14 @@
               <w:rPr>
                 <w:sz w:val="17"/>
               </w:rPr>
-              <w:t xml:space="preserve">Issuers ask Bursa for a halt pending a material announcement. Press examples show halts from market open to 5 pm on the next market day; Bursa decides.</w:t>
-            </w:r>
-          </w:p>
-        </w:tc>
-        <w:tc>
-          <w:tcPr/>
-          <w:p>
-            <w:pPr>
-              <w:pStyle w:val="Compact"/>
-              <w:spacing w:after="40" w:before="40"/>
-              <w:jc w:val="left"/>
-            </w:pPr>
+              <w:t xml:space="preserve">Issuers ask Bursa for a halt pending a material announcement. Press examples show halts from market open to 5 pm on the next market day (for example Tong Herr, 6 August 2026, and Axiata, December 2024); Bursa decides, and the cited sub-paragraphs of paragraph 3.1 vary between examples. Broker pages show the afternoon session closing at 5:00 pm, with pre-close from 4:45 pm to 4:50 pm: material news that arrives during trading hours needs an immediate announcement or a halt request</w:t>
+            </w:r>
+            <w:r>
+              <w:rPr>
+                <w:sz w:val="17"/>
+              </w:rPr>
+              <w:t xml:space="preserve"> </w:t>
+            </w:r>
             <w:r>
               <w:rPr>
                 <w:bCs/>
@@ -6537,6 +6637,30 @@
               </w:rPr>
               <w:t xml:space="preserve">[C]</w:t>
             </w:r>
+            <w:r>
+              <w:rPr>
+                <w:sz w:val="17"/>
+              </w:rPr>
+              <w:t xml:space="preserve">.</w:t>
+            </w:r>
+          </w:p>
+        </w:tc>
+        <w:tc>
+          <w:tcPr/>
+          <w:p>
+            <w:pPr>
+              <w:pStyle w:val="Compact"/>
+              <w:spacing w:after="40" w:before="40"/>
+              <w:jc w:val="left"/>
+            </w:pPr>
+            <w:r>
+              <w:rPr>
+                <w:bCs/>
+                <w:b/>
+                <w:sz w:val="17"/>
+              </w:rPr>
+              <w:t xml:space="preserve">[C]</w:t>
+            </w:r>
           </w:p>
         </w:tc>
       </w:tr>
@@ -6944,6 +7068,202 @@
                 <w:sz w:val="17"/>
               </w:rPr>
               <w:t xml:space="preserve">[V]</w:t>
+            </w:r>
+          </w:p>
+        </w:tc>
+      </w:tr>
+      <w:tr>
+        <w:tc>
+          <w:tcPr/>
+          <w:p>
+            <w:pPr>
+              <w:pStyle w:val="Compact"/>
+              <w:spacing w:after="40" w:before="40"/>
+              <w:jc w:val="left"/>
+            </w:pPr>
+            <w:r>
+              <w:rPr>
+                <w:sz w:val="17"/>
+              </w:rPr>
+              <w:t xml:space="preserve">11</w:t>
+            </w:r>
+          </w:p>
+        </w:tc>
+        <w:tc>
+          <w:tcPr/>
+          <w:p>
+            <w:pPr>
+              <w:pStyle w:val="Compact"/>
+              <w:spacing w:after="40" w:before="40"/>
+              <w:jc w:val="left"/>
+            </w:pPr>
+            <w:r>
+              <w:rPr>
+                <w:bCs/>
+                <w:b/>
+                <w:sz w:val="17"/>
+              </w:rPr>
+              <w:t xml:space="preserve">No selective disclosure</w:t>
+            </w:r>
+          </w:p>
+        </w:tc>
+        <w:tc>
+          <w:tcPr/>
+          <w:p>
+            <w:pPr>
+              <w:pStyle w:val="Compact"/>
+              <w:spacing w:after="40" w:before="40"/>
+              <w:jc w:val="left"/>
+            </w:pPr>
+            <w:r>
+              <w:rPr>
+                <w:sz w:val="17"/>
+              </w:rPr>
+              <w:t xml:space="preserve">Main LR Para 9.08(2); limited exceptions in 9.08(3)</w:t>
+            </w:r>
+          </w:p>
+        </w:tc>
+        <w:tc>
+          <w:tcPr/>
+          <w:p>
+            <w:pPr>
+              <w:pStyle w:val="Compact"/>
+              <w:spacing w:after="40" w:before="40"/>
+              <w:jc w:val="left"/>
+            </w:pPr>
+            <w:r>
+              <w:rPr>
+                <w:sz w:val="17"/>
+              </w:rPr>
+              <w:t xml:space="preserve">Material information must not go to analysts, shareholders, journalists or others before it has been fully disclosed to the public. Bursa's Q&amp;A, as summarised in secondary sources, allows narrow exceptions (for example disclosure to advisers in due diligence under strict confidentiality, with market activity closely monitored). Ask the Company Secretary before relying on any exception.</w:t>
+            </w:r>
+          </w:p>
+        </w:tc>
+        <w:tc>
+          <w:tcPr/>
+          <w:p>
+            <w:pPr>
+              <w:pStyle w:val="Compact"/>
+              <w:spacing w:after="40" w:before="40"/>
+              <w:jc w:val="left"/>
+            </w:pPr>
+            <w:r>
+              <w:rPr>
+                <w:bCs/>
+                <w:b/>
+                <w:sz w:val="17"/>
+              </w:rPr>
+              <w:t xml:space="preserve">[C, secondary]</w:t>
+            </w:r>
+            <w:r>
+              <w:rPr>
+                <w:sz w:val="17"/>
+              </w:rPr>
+              <w:t xml:space="preserve"> </w:t>
+            </w:r>
+            <w:r>
+              <w:rPr>
+                <w:sz w:val="17"/>
+              </w:rPr>
+              <w:t xml:space="preserve">— verify against the current text</w:t>
+            </w:r>
+          </w:p>
+        </w:tc>
+      </w:tr>
+      <w:tr>
+        <w:tc>
+          <w:tcPr/>
+          <w:p>
+            <w:pPr>
+              <w:pStyle w:val="Compact"/>
+              <w:spacing w:after="40" w:before="40"/>
+              <w:jc w:val="left"/>
+            </w:pPr>
+            <w:r>
+              <w:rPr>
+                <w:sz w:val="17"/>
+              </w:rPr>
+              <w:t xml:space="preserve">12</w:t>
+            </w:r>
+          </w:p>
+        </w:tc>
+        <w:tc>
+          <w:tcPr/>
+          <w:p>
+            <w:pPr>
+              <w:pStyle w:val="Compact"/>
+              <w:spacing w:after="40" w:before="40"/>
+              <w:jc w:val="left"/>
+            </w:pPr>
+            <w:r>
+              <w:rPr>
+                <w:bCs/>
+                <w:b/>
+                <w:sz w:val="17"/>
+              </w:rPr>
+              <w:t xml:space="preserve">Winding-up petitions</w:t>
+            </w:r>
+          </w:p>
+        </w:tc>
+        <w:tc>
+          <w:tcPr/>
+          <w:p>
+            <w:pPr>
+              <w:pStyle w:val="Compact"/>
+              <w:spacing w:after="40" w:before="40"/>
+              <w:jc w:val="left"/>
+            </w:pPr>
+            <w:r>
+              <w:rPr>
+                <w:sz w:val="17"/>
+              </w:rPr>
+              <w:t xml:space="preserve">Main LR Para 9.19(19)(a)(i)</w:t>
+            </w:r>
+          </w:p>
+        </w:tc>
+        <w:tc>
+          <w:tcPr/>
+          <w:p>
+            <w:pPr>
+              <w:pStyle w:val="Compact"/>
+              <w:spacing w:after="40" w:before="40"/>
+              <w:jc w:val="left"/>
+            </w:pPr>
+            <w:r>
+              <w:rPr>
+                <w:sz w:val="17"/>
+              </w:rPr>
+              <w:t xml:space="preserve">Bursa's September 2026 reprimand of Ahmad Zaki Resources cites this paragraph for failing to announce winding-up petitions immediately (delays of roughly 10 to 50 days), and states that ongoing settlement talks with the petitioner do not excuse non-disclosure. Treat any petition, notice or order as a disclosure trigger.</w:t>
+            </w:r>
+          </w:p>
+        </w:tc>
+        <w:tc>
+          <w:tcPr/>
+          <w:p>
+            <w:pPr>
+              <w:pStyle w:val="Compact"/>
+              <w:spacing w:after="40" w:before="40"/>
+              <w:jc w:val="left"/>
+            </w:pPr>
+            <w:r>
+              <w:rPr>
+                <w:bCs/>
+                <w:b/>
+                <w:sz w:val="17"/>
+              </w:rPr>
+              <w:t xml:space="preserve">[C, secondary]</w:t>
+            </w:r>
+            <w:r>
+              <w:rPr>
+                <w:sz w:val="17"/>
+              </w:rPr>
+              <w:t xml:space="preserve"> </w:t>
+            </w:r>
+            <w:r>
+              <w:rPr>
+                <w:sz w:val="17"/>
+              </w:rPr>
+              <w:t xml:space="preserve">— verify against the current text</w:t>
             </w:r>
           </w:p>
         </w:tc>
@@ -7385,7 +7705,7 @@
               <w:rPr>
                 <w:sz w:val="17"/>
               </w:rPr>
-              <w:t xml:space="preserve">Notify the Commissioner as soon as practicable and no later than 72 hours from the breach occurring or being informed. Reported thresholds: significant harm or more than 1,000 individuals. If late, a written explanation with evidence is required. Notify affected individuals without unnecessary delay and no later than 7 days after notifying the Commissioner. Each controller notifies separately.</w:t>
+              <w:t xml:space="preserve">Notify the Commissioner as soon as practicable and no later than 72 hours from the breach occurring or being informed. Reported thresholds: significant harm or more than 1,000 individuals. If late, a written explanation with evidence is required. Notify affected individuals without unnecessary delay and no later than 7 days after notifying the Commissioner. Each controller notifies separately. Law-firm summaries differ on whether the 72-hour window comes from the amended Act or from the Commissioner's guideline; the guideline sets it out in any case.</w:t>
             </w:r>
           </w:p>
         </w:tc>
@@ -38707,7 +39027,7 @@
     <w:bookmarkEnd w:id="172"/>
     <w:bookmarkEnd w:id="173"/>
     <w:bookmarkEnd w:id="174"/>
-    <w:bookmarkStart w:id="206" w:name="appendices"/>
+    <w:bookmarkStart w:id="210" w:name="appendices"/>
     <w:p>
       <w:pPr>
         <w:pStyle w:val="Heading1"/>
@@ -40943,7 +41263,7 @@
       </w:tr>
     </w:tbl>
     <w:bookmarkEnd w:id="176"/>
-    <w:bookmarkStart w:id="203" w:name="X8d16d21a57fa0b92120c5ecb779798357e3d26d"/>
+    <w:bookmarkStart w:id="207" w:name="X8d16d21a57fa0b92120c5ecb779798357e3d26d"/>
     <w:p>
       <w:pPr>
         <w:pStyle w:val="Heading2"/>
@@ -40952,7 +41272,7 @@
         <w:t xml:space="preserve">Appendix C — Source and verification register</w:t>
       </w:r>
     </w:p>
-    <w:bookmarkStart w:id="201" w:name="X36b0ec1b86b88a05839c89c161b3495586d0ff7"/>
+    <w:bookmarkStart w:id="205" w:name="X36b0ec1b86b88a05839c89c161b3495586d0ff7"/>
     <w:p>
       <w:pPr>
         <w:pStyle w:val="Heading3"/>
@@ -42639,9 +42959,329 @@
           </w:p>
         </w:tc>
       </w:tr>
+      <w:tr>
+        <w:tc>
+          <w:tcPr/>
+          <w:p>
+            <w:pPr>
+              <w:pStyle w:val="Compact"/>
+              <w:spacing w:after="40" w:before="40"/>
+              <w:jc w:val="left"/>
+            </w:pPr>
+            <w:r>
+              <w:rPr>
+                <w:sz w:val="17"/>
+              </w:rPr>
+              <w:t xml:space="preserve">25</w:t>
+            </w:r>
+          </w:p>
+        </w:tc>
+        <w:tc>
+          <w:tcPr/>
+          <w:p>
+            <w:pPr>
+              <w:pStyle w:val="Compact"/>
+              <w:spacing w:after="40" w:before="40"/>
+              <w:jc w:val="left"/>
+            </w:pPr>
+            <w:r>
+              <w:rPr>
+                <w:sz w:val="17"/>
+              </w:rPr>
+              <w:t xml:space="preserve">Business Today — Zetrix AI share plunges 50%, Bursa issues UMA query (28 Aug 2026) —</w:t>
+            </w:r>
+            <w:r>
+              <w:rPr>
+                <w:sz w:val="17"/>
+              </w:rPr>
+              <w:t xml:space="preserve"> </w:t>
+            </w:r>
+            <w:hyperlink r:id="rId201">
+              <w:r>
+                <w:rPr>
+                  <w:rStyle w:val="Hyperlink"/>
+                </w:rPr>
+                <w:t xml:space="preserve">article</w:t>
+              </w:r>
+            </w:hyperlink>
+          </w:p>
+        </w:tc>
+        <w:tc>
+          <w:tcPr/>
+          <w:p>
+            <w:pPr>
+              <w:pStyle w:val="Compact"/>
+              <w:spacing w:after="40" w:before="40"/>
+              <w:jc w:val="left"/>
+            </w:pPr>
+            <w:r>
+              <w:rPr>
+                <w:sz w:val="17"/>
+              </w:rPr>
+              <w:t xml:space="preserve">UMA query content and paragraph cited</w:t>
+            </w:r>
+          </w:p>
+        </w:tc>
+      </w:tr>
+      <w:tr>
+        <w:tc>
+          <w:tcPr/>
+          <w:p>
+            <w:pPr>
+              <w:pStyle w:val="Compact"/>
+              <w:spacing w:after="40" w:before="40"/>
+              <w:jc w:val="left"/>
+            </w:pPr>
+            <w:r>
+              <w:rPr>
+                <w:sz w:val="17"/>
+              </w:rPr>
+              <w:t xml:space="preserve">26</w:t>
+            </w:r>
+          </w:p>
+        </w:tc>
+        <w:tc>
+          <w:tcPr/>
+          <w:p>
+            <w:pPr>
+              <w:pStyle w:val="Compact"/>
+              <w:spacing w:after="40" w:before="40"/>
+              <w:jc w:val="left"/>
+            </w:pPr>
+            <w:r>
+              <w:rPr>
+                <w:sz w:val="17"/>
+              </w:rPr>
+              <w:t xml:space="preserve">Business Today — Tong Herr requests for share suspension pending key announcement (6 Aug 2026) —</w:t>
+            </w:r>
+            <w:r>
+              <w:rPr>
+                <w:sz w:val="17"/>
+              </w:rPr>
+              <w:t xml:space="preserve"> </w:t>
+            </w:r>
+            <w:hyperlink r:id="rId202">
+              <w:r>
+                <w:rPr>
+                  <w:rStyle w:val="Hyperlink"/>
+                </w:rPr>
+                <w:t xml:space="preserve">article</w:t>
+              </w:r>
+            </w:hyperlink>
+          </w:p>
+        </w:tc>
+        <w:tc>
+          <w:tcPr/>
+          <w:p>
+            <w:pPr>
+              <w:pStyle w:val="Compact"/>
+              <w:spacing w:after="40" w:before="40"/>
+              <w:jc w:val="left"/>
+            </w:pPr>
+            <w:r>
+              <w:rPr>
+                <w:sz w:val="17"/>
+              </w:rPr>
+              <w:t xml:space="preserve">Practice Note 2 halt example</w:t>
+            </w:r>
+          </w:p>
+        </w:tc>
+      </w:tr>
+      <w:tr>
+        <w:tc>
+          <w:tcPr/>
+          <w:p>
+            <w:pPr>
+              <w:pStyle w:val="Compact"/>
+              <w:spacing w:after="40" w:before="40"/>
+              <w:jc w:val="left"/>
+            </w:pPr>
+            <w:r>
+              <w:rPr>
+                <w:sz w:val="17"/>
+              </w:rPr>
+              <w:t xml:space="preserve">27</w:t>
+            </w:r>
+          </w:p>
+        </w:tc>
+        <w:tc>
+          <w:tcPr/>
+          <w:p>
+            <w:pPr>
+              <w:pStyle w:val="Compact"/>
+              <w:spacing w:after="40" w:before="40"/>
+              <w:jc w:val="left"/>
+            </w:pPr>
+            <w:r>
+              <w:rPr>
+                <w:sz w:val="17"/>
+              </w:rPr>
+              <w:t xml:space="preserve">Business Today — Bursa reprimands Ahmad Zaki over delayed winding-up petition disclosures (25 Sep 2026) —</w:t>
+            </w:r>
+            <w:r>
+              <w:rPr>
+                <w:sz w:val="17"/>
+              </w:rPr>
+              <w:t xml:space="preserve"> </w:t>
+            </w:r>
+            <w:hyperlink r:id="rId203">
+              <w:r>
+                <w:rPr>
+                  <w:rStyle w:val="Hyperlink"/>
+                </w:rPr>
+                <w:t xml:space="preserve">article</w:t>
+              </w:r>
+            </w:hyperlink>
+          </w:p>
+        </w:tc>
+        <w:tc>
+          <w:tcPr/>
+          <w:p>
+            <w:pPr>
+              <w:pStyle w:val="Compact"/>
+              <w:spacing w:after="40" w:before="40"/>
+              <w:jc w:val="left"/>
+            </w:pPr>
+            <w:r>
+              <w:rPr>
+                <w:sz w:val="17"/>
+              </w:rPr>
+              <w:t xml:space="preserve">Para 9.19(19)(a)(i); settlement talks no excuse</w:t>
+            </w:r>
+          </w:p>
+        </w:tc>
+      </w:tr>
+      <w:tr>
+        <w:tc>
+          <w:tcPr/>
+          <w:p>
+            <w:pPr>
+              <w:pStyle w:val="Compact"/>
+              <w:spacing w:after="40" w:before="40"/>
+              <w:jc w:val="left"/>
+            </w:pPr>
+            <w:r>
+              <w:rPr>
+                <w:sz w:val="17"/>
+              </w:rPr>
+              <w:t xml:space="preserve">28</w:t>
+            </w:r>
+          </w:p>
+        </w:tc>
+        <w:tc>
+          <w:tcPr/>
+          <w:p>
+            <w:pPr>
+              <w:pStyle w:val="Compact"/>
+              <w:spacing w:after="40" w:before="40"/>
+              <w:jc w:val="left"/>
+            </w:pPr>
+            <w:r>
+              <w:rPr>
+                <w:sz w:val="17"/>
+              </w:rPr>
+              <w:t xml:space="preserve">RHB TradeSmart — Trading on Bursa FAQ —</w:t>
+            </w:r>
+            <w:r>
+              <w:rPr>
+                <w:sz w:val="17"/>
+              </w:rPr>
+              <w:t xml:space="preserve"> </w:t>
+            </w:r>
+            <w:hyperlink r:id="rId204">
+              <w:r>
+                <w:rPr>
+                  <w:rStyle w:val="Hyperlink"/>
+                </w:rPr>
+                <w:t xml:space="preserve">page</w:t>
+              </w:r>
+            </w:hyperlink>
+          </w:p>
+        </w:tc>
+        <w:tc>
+          <w:tcPr/>
+          <w:p>
+            <w:pPr>
+              <w:pStyle w:val="Compact"/>
+              <w:spacing w:after="40" w:before="40"/>
+              <w:jc w:val="left"/>
+            </w:pPr>
+            <w:r>
+              <w:rPr>
+                <w:sz w:val="17"/>
+              </w:rPr>
+              <w:t xml:space="preserve">Trading phases and 5:00 pm close (broker page)</w:t>
+            </w:r>
+          </w:p>
+        </w:tc>
+      </w:tr>
+      <w:tr>
+        <w:tc>
+          <w:tcPr/>
+          <w:p>
+            <w:pPr>
+              <w:pStyle w:val="Compact"/>
+              <w:spacing w:after="40" w:before="40"/>
+              <w:jc w:val="left"/>
+            </w:pPr>
+            <w:r>
+              <w:rPr>
+                <w:sz w:val="17"/>
+              </w:rPr>
+              <w:t xml:space="preserve">29</w:t>
+            </w:r>
+          </w:p>
+        </w:tc>
+        <w:tc>
+          <w:tcPr/>
+          <w:p>
+            <w:pPr>
+              <w:pStyle w:val="Compact"/>
+              <w:spacing w:after="40" w:before="40"/>
+              <w:jc w:val="left"/>
+            </w:pPr>
+            <w:r>
+              <w:rPr>
+                <w:sz w:val="17"/>
+              </w:rPr>
+              <w:t xml:space="preserve">Baker McKenzie — Bursa Malaysia continuing obligations (resource hub) —</w:t>
+            </w:r>
+            <w:r>
+              <w:rPr>
+                <w:sz w:val="17"/>
+              </w:rPr>
+              <w:t xml:space="preserve"> </w:t>
+            </w:r>
+            <w:hyperlink r:id="rId180">
+              <w:r>
+                <w:rPr>
+                  <w:rStyle w:val="Hyperlink"/>
+                </w:rPr>
+                <w:t xml:space="preserve">page</w:t>
+              </w:r>
+            </w:hyperlink>
+          </w:p>
+        </w:tc>
+        <w:tc>
+          <w:tcPr/>
+          <w:p>
+            <w:pPr>
+              <w:pStyle w:val="Compact"/>
+              <w:spacing w:after="40" w:before="40"/>
+              <w:jc w:val="left"/>
+            </w:pPr>
+            <w:r>
+              <w:rPr>
+                <w:sz w:val="17"/>
+              </w:rPr>
+              <w:t xml:space="preserve">Continuing-disclosure framework</w:t>
+            </w:r>
+          </w:p>
+        </w:tc>
+      </w:tr>
     </w:tbl>
-    <w:bookmarkEnd w:id="201"/>
-    <w:bookmarkStart w:id="202" w:name="Xfbd9be134be1244d9b974cb3c795a5224692734"/>
+    <w:bookmarkEnd w:id="205"/>
+    <w:bookmarkStart w:id="206" w:name="Xfbd9be134be1244d9b974cb3c795a5224692734"/>
     <w:p>
       <w:pPr>
         <w:pStyle w:val="Heading3"/>
@@ -42659,7 +43299,7 @@
         <w:pStyle w:val="Compact"/>
       </w:pPr>
       <w:r>
-        <w:t xml:space="preserve">Exact wording and sub-paragraphs of Main LR Paras 9.03, 9.04, 9.05 (conditions), 9.16, 9.22, 9.23; Chapter 14 closed-period length; Practice Note 2 wording; PN17 criteria in current text (including RM40 million); ACE Market equivalents (including GN3 and Sponsor obligations).</w:t>
+        <w:t xml:space="preserve">Exact wording and sub-paragraphs of Main LR Paras 9.03, 9.04, 9.05 (conditions), 9.08(2) and (3), 9.11 versus 9.16 (which paragraph Bursa currently cites for UMA queries), 9.19(19), 9.22, 9.23 (items 25 to 29 in C.1 are secondary summaries; Bursa's own text was not reachable from the drafting environment); Chapter 14 closed-period length; Practice Note 2 wording; PN17 criteria in current text (including RM40 million); ACE Market equivalents (including GN3 and Sponsor obligations).</w:t>
       </w:r>
     </w:p>
     <w:p>
@@ -42758,9 +43398,9 @@
         <w:t xml:space="preserve">Sector-specific obligations for your industry.</w:t>
       </w:r>
     </w:p>
-    <w:bookmarkEnd w:id="202"/>
-    <w:bookmarkEnd w:id="203"/>
-    <w:bookmarkStart w:id="204" w:name="Xfcf15fbdaeda0e4baa6dfadf8c758493a3fa6e1"/>
+    <w:bookmarkEnd w:id="206"/>
+    <w:bookmarkEnd w:id="207"/>
+    <w:bookmarkStart w:id="208" w:name="Xfcf15fbdaeda0e4baa6dfadf8c758493a3fa6e1"/>
     <w:p>
       <w:pPr>
         <w:pStyle w:val="Heading2"/>
@@ -42949,8 +43589,8 @@
         <w:t xml:space="preserve">Review Bahasa Malaysia and other-language templates for legal and linguistic accuracy.</w:t>
       </w:r>
     </w:p>
-    <w:bookmarkEnd w:id="204"/>
-    <w:bookmarkStart w:id="205" w:name="appendix-e--version-history"/>
+    <w:bookmarkEnd w:id="208"/>
+    <w:bookmarkStart w:id="209" w:name="appendix-e--version-history"/>
     <w:p>
       <w:pPr>
         <w:pStyle w:val="Heading2"/>
@@ -43147,8 +43787,8 @@
         <w:t xml:space="preserve">End of playbook.</w:t>
       </w:r>
     </w:p>
-    <w:bookmarkEnd w:id="205"/>
-    <w:bookmarkEnd w:id="206"/>
+    <w:bookmarkEnd w:id="209"/>
+    <w:bookmarkEnd w:id="210"/>
     <w:sectPr>
       <w:footerReference w:type="default" r:id="rId9"/>
       <w:pgSz w:w="11906" w:h="16838"/>

</xml_diff>

<commit_message>
Playbook: label new Section 5.1 rows 10a and 10b to avoid duplicate numbering
Co-Authored-By: Claude Sonnet 5.5 <noreply@anthropic.com>
Claude-Session: https://claude.ai/code/session_01JcQ7arsrDHhSr3Jj9M4wY7
</commit_message>
<xml_diff>
--- a/docs/crisis-communications-playbook-malaysia-plc.docx
+++ b/docs/crisis-communications-playbook-malaysia-plc.docx
@@ -7085,7 +7085,7 @@
               <w:rPr>
                 <w:sz w:val="17"/>
               </w:rPr>
-              <w:t xml:space="preserve">11</w:t>
+              <w:t xml:space="preserve">10a</w:t>
             </w:r>
           </w:p>
         </w:tc>
@@ -7183,7 +7183,7 @@
               <w:rPr>
                 <w:sz w:val="17"/>
               </w:rPr>
-              <w:t xml:space="preserve">12</w:t>
+              <w:t xml:space="preserve">10b</w:t>
             </w:r>
           </w:p>
         </w:tc>

</xml_diff>